<commit_message>
Put the dashboard screenshot into section 5, and document what is left
The section carried a bracketed placeholder where its figures should be. The
merge now drops the screenshot in - preferring the merged dashboard's exports
and falling back to the pre-merge performance page until those exist - and
renumbers the caption to match how many it found.

Co-Authored-By: Claude Opus 5 <noreply@anthropic.com>
</commit_message>
<xml_diff>
--- a/report/M4/BIN381_M4_Report_Group_P1.docx
+++ b/report/M4/BIN381_M4_Report_Group_P1.docx
@@ -5628,17 +5628,44 @@
     </w:p>
     <w:p>
       <w:pPr>
-        <w:spacing w:after="40"/>
         <w:jc w:val="center"/>
       </w:pPr>
       <w:r>
         <w:rPr>
           <w:rFonts w:ascii="Calibri" w:hAnsi="Calibri" w:eastAsia="Calibri" w:cs="Calibri"/>
-          <w:i/>
-          <w:color w:val="808080"/>
-          <w:sz w:val="18"/>
-        </w:rPr>
-        <w:t>[Figures 3 and 4 — pbi_m4_1_overview.png and pbi_m4_4_performance.png, side by side at about 7.5 cm wide each]</w:t>
+        </w:rPr>
+        <w:drawing>
+          <wp:inline xmlns:a="http://schemas.openxmlformats.org/drawingml/2006/main" xmlns:pic="http://schemas.openxmlformats.org/drawingml/2006/picture">
+            <wp:extent cx="5580000" cy="3136780"/>
+            <wp:docPr id="1861712150" name="Picture 1861712150"/>
+            <wp:cNvGraphicFramePr>
+              <a:graphicFrameLocks noChangeAspect="1"/>
+            </wp:cNvGraphicFramePr>
+            <a:graphic>
+              <a:graphicData uri="http://schemas.openxmlformats.org/drawingml/2006/picture">
+                <pic:pic>
+                  <pic:nvPicPr>
+                    <pic:cNvPr id="0" name="pbi_b1_performance.png"/>
+                    <pic:cNvPicPr/>
+                  </pic:nvPicPr>
+                  <pic:blipFill>
+                    <a:blip r:embed="rId16"/>
+                    <a:stretch>
+                      <a:fillRect/>
+                    </a:stretch>
+                  </pic:blipFill>
+                  <pic:spPr>
+                    <a:xfrm>
+                      <a:off x="0" y="0"/>
+                      <a:ext cx="5580000" cy="3136780"/>
+                    </a:xfrm>
+                    <a:prstGeom prst="rect"/>
+                  </pic:spPr>
+                </pic:pic>
+              </a:graphicData>
+            </a:graphic>
+          </wp:inline>
+        </w:drawing>
       </w:r>
     </w:p>
     <w:p>
@@ -5651,7 +5678,7 @@
           <w:i/>
           <w:sz w:val="18"/>
         </w:rPr>
-        <w:t>Figures 3-4 The landing page, and test-set performance with the threshold what-if.</w:t>
+        <w:t>Figure 3  Test-set performance with the threshold what-if.</w:t>
       </w:r>
     </w:p>
     <w:p>
@@ -10825,7 +10852,7 @@
                 <w:rFonts w:ascii="Calibri" w:hAnsi="Calibri" w:eastAsia="Calibri" w:cs="Calibri"/>
                 <w:sz w:val="16"/>
               </w:rPr>
-              <w:t>TO CONFIRM</w:t>
+              <w:t>19 Oct</w:t>
             </w:r>
           </w:p>
         </w:tc>
@@ -10869,7 +10896,7 @@
                 <w:rFonts w:ascii="Calibri" w:hAnsi="Calibri" w:eastAsia="Calibri" w:cs="Calibri"/>
                 <w:sz w:val="16"/>
               </w:rPr>
-              <w:t>TO CONFIRM</w:t>
+              <w:t>"Don't know" and "refused" answers to the eight food-insecurity questions could have been counted as "no", which would label unsure households as food secure. The model could also have learned from the same questions it was meant to predict.</w:t>
             </w:r>
           </w:p>
         </w:tc>
@@ -10891,7 +10918,7 @@
                 <w:rFonts w:ascii="Calibri" w:hAnsi="Calibri" w:eastAsia="Calibri" w:cs="Calibri"/>
                 <w:sz w:val="16"/>
               </w:rPr>
-              <w:t>TO CONFIRM</w:t>
+              <w:t>Those answers were recoded to missing. The 15 households with no valid answer were set aside before the split. Sixteen columns that define or closely proxy the target were kept out of the predictors, with a check that stops the notebook if one appears.</w:t>
             </w:r>
           </w:p>
         </w:tc>
@@ -10959,7 +10986,7 @@
                 <w:rFonts w:ascii="Calibri" w:hAnsi="Calibri" w:eastAsia="Calibri" w:cs="Calibri"/>
                 <w:sz w:val="16"/>
               </w:rPr>
-              <w:t>TO CONFIRM</w:t>
+              <w:t>19 Oct</w:t>
             </w:r>
           </w:p>
         </w:tc>
@@ -11003,7 +11030,7 @@
                 <w:rFonts w:ascii="Calibri" w:hAnsi="Calibri" w:eastAsia="Calibri" w:cs="Calibri"/>
                 <w:sz w:val="16"/>
               </w:rPr>
-              <w:t>TO CONFIRM</w:t>
+              <w:t>One headline recall would have hidden that the screen performs far worse for some groups than others, and the obvious patch - a lower threshold for higher-income households - would mean treating households differently by income on the basis of a proxy.</w:t>
             </w:r>
           </w:p>
         </w:tc>
@@ -11025,7 +11052,7 @@
                 <w:rFonts w:ascii="Calibri" w:hAnsi="Calibri" w:eastAsia="Calibri" w:cs="Calibri"/>
                 <w:sz w:val="16"/>
               </w:rPr>
-              <w:t>TO CONFIRM</w:t>
+              <w:t>Equal opportunity was chosen as the fairness criterion and recall is measured per subgroup. The gaps are published in section 4 and on the dashboard rather than patched: 39.2% recall above R11,500 and 61.7% with no grant recipients. Recommendation 5 asks for a monthly audit of lower-risk households in exactly those groups instead.</w:t>
             </w:r>
           </w:p>
         </w:tc>
@@ -12351,7 +12378,31 @@
                 <w:rFonts w:ascii="Calibri" w:hAnsi="Calibri" w:eastAsia="Calibri" w:cs="Calibri"/>
                 <w:sz w:val="16"/>
               </w:rPr>
-              <w:t>TO CONFIRM</w:t>
+              <w:t>14 Oct 2026</w:t>
+            </w:r>
+          </w:p>
+          <w:p>
+            <w:pPr>
+              <w:spacing w:after="0"/>
+            </w:pPr>
+            <w:r>
+              <w:rPr>
+                <w:rFonts w:ascii="Calibri" w:hAnsi="Calibri" w:eastAsia="Calibri" w:cs="Calibri"/>
+                <w:sz w:val="16"/>
+              </w:rPr>
+              <w:t>Alexander (A)</w:t>
+            </w:r>
+          </w:p>
+          <w:p>
+            <w:pPr>
+              <w:spacing w:after="0"/>
+            </w:pPr>
+            <w:r>
+              <w:rPr>
+                <w:rFonts w:ascii="Calibri" w:hAnsi="Calibri" w:eastAsia="Calibri" w:cs="Calibri"/>
+                <w:sz w:val="16"/>
+              </w:rPr>
+              <w:t>Claude (Anthropic)</w:t>
             </w:r>
           </w:p>
         </w:tc>
@@ -12373,7 +12424,7 @@
                 <w:rFonts w:ascii="Calibri" w:hAnsi="Calibri" w:eastAsia="Calibri" w:cs="Calibri"/>
                 <w:sz w:val="16"/>
               </w:rPr>
-              <w:t>TO CONFIRM</w:t>
+              <w:t>Milestone 4 team guideline. Claude read the Milestone 4 brief and the repository and produced a Word guideline: deliverables, a proposed A/B/C split, a plan for each task, the marks map, a timeline and likely defence questions.</w:t>
             </w:r>
           </w:p>
         </w:tc>
@@ -12395,7 +12446,7 @@
                 <w:rFonts w:ascii="Calibri" w:hAnsi="Calibri" w:eastAsia="Calibri" w:cs="Calibri"/>
                 <w:sz w:val="16"/>
               </w:rPr>
-              <w:t>TO CONFIRM</w:t>
+              <w:t>Deliverables and rubric compared line by line with the brief. Statements about what was already in the repository were checked against the cloned repository.</w:t>
             </w:r>
           </w:p>
         </w:tc>
@@ -12417,7 +12468,551 @@
                 <w:rFonts w:ascii="Calibri" w:hAnsi="Calibri" w:eastAsia="Calibri" w:cs="Calibri"/>
                 <w:sz w:val="16"/>
               </w:rPr>
-              <w:t>TO CONFIRM</w:t>
+              <w:t>Used as a planning aid. The split was a proposal, and the group agreed on its own.</w:t>
+            </w:r>
+          </w:p>
+        </w:tc>
+      </w:tr>
+      <w:tr>
+        <w:tc>
+          <w:tcPr>
+            <w:tcW w:type="dxa" w:w="964"/>
+          </w:tcPr>
+          <w:p>
+            <w:pPr>
+              <w:spacing w:after="0"/>
+            </w:pPr>
+            <w:r>
+              <w:rPr>
+                <w:rFonts w:ascii="Calibri" w:hAnsi="Calibri" w:eastAsia="Calibri" w:cs="Calibri"/>
+              </w:rPr>
+            </w:r>
+            <w:r>
+              <w:rPr>
+                <w:rFonts w:ascii="Calibri" w:hAnsi="Calibri" w:eastAsia="Calibri" w:cs="Calibri"/>
+                <w:sz w:val="16"/>
+              </w:rPr>
+              <w:t>AI-M4-A2</w:t>
+            </w:r>
+          </w:p>
+        </w:tc>
+        <w:tc>
+          <w:tcPr>
+            <w:tcW w:type="dxa" w:w="1361"/>
+          </w:tcPr>
+          <w:p>
+            <w:pPr>
+              <w:spacing w:after="0"/>
+            </w:pPr>
+            <w:r>
+              <w:rPr>
+                <w:rFonts w:ascii="Calibri" w:hAnsi="Calibri" w:eastAsia="Calibri" w:cs="Calibri"/>
+              </w:rPr>
+            </w:r>
+            <w:r>
+              <w:rPr>
+                <w:rFonts w:ascii="Calibri" w:hAnsi="Calibri" w:eastAsia="Calibri" w:cs="Calibri"/>
+                <w:sz w:val="16"/>
+              </w:rPr>
+              <w:t>14 Oct 2026</w:t>
+            </w:r>
+          </w:p>
+          <w:p>
+            <w:pPr>
+              <w:spacing w:after="0"/>
+            </w:pPr>
+            <w:r>
+              <w:rPr>
+                <w:rFonts w:ascii="Calibri" w:hAnsi="Calibri" w:eastAsia="Calibri" w:cs="Calibri"/>
+                <w:sz w:val="16"/>
+              </w:rPr>
+              <w:t>Alexander (A)</w:t>
+            </w:r>
+          </w:p>
+          <w:p>
+            <w:pPr>
+              <w:spacing w:after="0"/>
+            </w:pPr>
+            <w:r>
+              <w:rPr>
+                <w:rFonts w:ascii="Calibri" w:hAnsi="Calibri" w:eastAsia="Calibri" w:cs="Calibri"/>
+                <w:sz w:val="16"/>
+              </w:rPr>
+              <w:t>Claude (Anthropic)</w:t>
+            </w:r>
+          </w:p>
+        </w:tc>
+        <w:tc>
+          <w:tcPr>
+            <w:tcW w:type="dxa" w:w="2438"/>
+          </w:tcPr>
+          <w:p>
+            <w:pPr>
+              <w:spacing w:after="0"/>
+            </w:pPr>
+            <w:r>
+              <w:rPr>
+                <w:rFonts w:ascii="Calibri" w:hAnsi="Calibri" w:eastAsia="Calibri" w:cs="Calibri"/>
+              </w:rPr>
+            </w:r>
+            <w:r>
+              <w:rPr>
+                <w:rFonts w:ascii="Calibri" w:hAnsi="Calibri" w:eastAsia="Calibri" w:cs="Calibri"/>
+                <w:sz w:val="16"/>
+              </w:rPr>
+              <w:t>Reviewed sections 1 to 3 and gave advice on talking points for slides 1 to 4.</w:t>
+            </w:r>
+          </w:p>
+        </w:tc>
+        <w:tc>
+          <w:tcPr>
+            <w:tcW w:type="dxa" w:w="2154"/>
+          </w:tcPr>
+          <w:p>
+            <w:pPr>
+              <w:spacing w:after="0"/>
+            </w:pPr>
+            <w:r>
+              <w:rPr>
+                <w:rFonts w:ascii="Calibri" w:hAnsi="Calibri" w:eastAsia="Calibri" w:cs="Calibri"/>
+              </w:rPr>
+            </w:r>
+            <w:r>
+              <w:rPr>
+                <w:rFonts w:ascii="Calibri" w:hAnsi="Calibri" w:eastAsia="Calibri" w:cs="Calibri"/>
+                <w:sz w:val="16"/>
+              </w:rPr>
+              <w:t>Looked through the previous milestones as well as the rubric and gave talking points.</w:t>
+            </w:r>
+          </w:p>
+        </w:tc>
+        <w:tc>
+          <w:tcPr>
+            <w:tcW w:type="dxa" w:w="2098"/>
+          </w:tcPr>
+          <w:p>
+            <w:pPr>
+              <w:spacing w:after="0"/>
+            </w:pPr>
+            <w:r>
+              <w:rPr>
+                <w:rFonts w:ascii="Calibri" w:hAnsi="Calibri" w:eastAsia="Calibri" w:cs="Calibri"/>
+              </w:rPr>
+            </w:r>
+            <w:r>
+              <w:rPr>
+                <w:rFonts w:ascii="Calibri" w:hAnsi="Calibri" w:eastAsia="Calibri" w:cs="Calibri"/>
+                <w:sz w:val="16"/>
+              </w:rPr>
+              <w:t>I looked through the review and made changes to it as well as created the slides by myself. I am responsible for every sentence.</w:t>
+            </w:r>
+          </w:p>
+        </w:tc>
+      </w:tr>
+      <w:tr>
+        <w:tc>
+          <w:tcPr>
+            <w:tcW w:type="dxa" w:w="964"/>
+          </w:tcPr>
+          <w:p>
+            <w:pPr>
+              <w:spacing w:after="0"/>
+            </w:pPr>
+            <w:r>
+              <w:rPr>
+                <w:rFonts w:ascii="Calibri" w:hAnsi="Calibri" w:eastAsia="Calibri" w:cs="Calibri"/>
+              </w:rPr>
+            </w:r>
+            <w:r>
+              <w:rPr>
+                <w:rFonts w:ascii="Calibri" w:hAnsi="Calibri" w:eastAsia="Calibri" w:cs="Calibri"/>
+                <w:sz w:val="16"/>
+              </w:rPr>
+              <w:t>AI-M4-A3</w:t>
+            </w:r>
+          </w:p>
+        </w:tc>
+        <w:tc>
+          <w:tcPr>
+            <w:tcW w:type="dxa" w:w="1361"/>
+          </w:tcPr>
+          <w:p>
+            <w:pPr>
+              <w:spacing w:after="0"/>
+            </w:pPr>
+            <w:r>
+              <w:rPr>
+                <w:rFonts w:ascii="Calibri" w:hAnsi="Calibri" w:eastAsia="Calibri" w:cs="Calibri"/>
+              </w:rPr>
+            </w:r>
+            <w:r>
+              <w:rPr>
+                <w:rFonts w:ascii="Calibri" w:hAnsi="Calibri" w:eastAsia="Calibri" w:cs="Calibri"/>
+                <w:sz w:val="16"/>
+              </w:rPr>
+              <w:t>19 Oct 2026</w:t>
+            </w:r>
+          </w:p>
+          <w:p>
+            <w:pPr>
+              <w:spacing w:after="0"/>
+            </w:pPr>
+            <w:r>
+              <w:rPr>
+                <w:rFonts w:ascii="Calibri" w:hAnsi="Calibri" w:eastAsia="Calibri" w:cs="Calibri"/>
+                <w:sz w:val="16"/>
+              </w:rPr>
+              <w:t>Alexander (A)</w:t>
+            </w:r>
+          </w:p>
+          <w:p>
+            <w:pPr>
+              <w:spacing w:after="0"/>
+            </w:pPr>
+            <w:r>
+              <w:rPr>
+                <w:rFonts w:ascii="Calibri" w:hAnsi="Calibri" w:eastAsia="Calibri" w:cs="Calibri"/>
+                <w:sz w:val="16"/>
+              </w:rPr>
+              <w:t>Claude (Anthropic)</w:t>
+            </w:r>
+          </w:p>
+        </w:tc>
+        <w:tc>
+          <w:tcPr>
+            <w:tcW w:type="dxa" w:w="2438"/>
+          </w:tcPr>
+          <w:p>
+            <w:pPr>
+              <w:spacing w:after="0"/>
+            </w:pPr>
+            <w:r>
+              <w:rPr>
+                <w:rFonts w:ascii="Calibri" w:hAnsi="Calibri" w:eastAsia="Calibri" w:cs="Calibri"/>
+              </w:rPr>
+            </w:r>
+            <w:r>
+              <w:rPr>
+                <w:rFonts w:ascii="Calibri" w:hAnsi="Calibri" w:eastAsia="Calibri" w:cs="Calibri"/>
+                <w:sz w:val="16"/>
+              </w:rPr>
+              <w:t>Four figures: a CRISP-DM diagram, a data-flow diagram from the cleaned files to the train/test split, a chart of the three food-insecurity tiers, and a chart of cross-validated ROC-AUC for the four models. Claude wrote the plotting script.</w:t>
+            </w:r>
+          </w:p>
+        </w:tc>
+        <w:tc>
+          <w:tcPr>
+            <w:tcW w:type="dxa" w:w="2154"/>
+          </w:tcPr>
+          <w:p>
+            <w:pPr>
+              <w:spacing w:after="0"/>
+            </w:pPr>
+            <w:r>
+              <w:rPr>
+                <w:rFonts w:ascii="Calibri" w:hAnsi="Calibri" w:eastAsia="Calibri" w:cs="Calibri"/>
+              </w:rPr>
+            </w:r>
+            <w:r>
+              <w:rPr>
+                <w:rFonts w:ascii="Calibri" w:hAnsi="Calibri" w:eastAsia="Calibri" w:cs="Calibri"/>
+                <w:sz w:val="16"/>
+              </w:rPr>
+              <w:t>Every value in the figures was compared with Table 10.5 of the Milestone 3 report and the model parameter table. Each image was viewed for errors and overlaps.</w:t>
+            </w:r>
+          </w:p>
+        </w:tc>
+        <w:tc>
+          <w:tcPr>
+            <w:tcW w:type="dxa" w:w="2098"/>
+          </w:tcPr>
+          <w:p>
+            <w:pPr>
+              <w:spacing w:after="0"/>
+            </w:pPr>
+            <w:r>
+              <w:rPr>
+                <w:rFonts w:ascii="Calibri" w:hAnsi="Calibri" w:eastAsia="Calibri" w:cs="Calibri"/>
+              </w:rPr>
+            </w:r>
+            <w:r>
+              <w:rPr>
+                <w:rFonts w:ascii="Calibri" w:hAnsi="Calibri" w:eastAsia="Calibri" w:cs="Calibri"/>
+                <w:sz w:val="16"/>
+              </w:rPr>
+              <w:t>Figures 1 and 2 are in the report. The tier chart was left out for space.</w:t>
+            </w:r>
+          </w:p>
+        </w:tc>
+      </w:tr>
+      <w:tr>
+        <w:tc>
+          <w:tcPr>
+            <w:tcW w:type="dxa" w:w="964"/>
+          </w:tcPr>
+          <w:p>
+            <w:pPr>
+              <w:spacing w:after="0"/>
+            </w:pPr>
+            <w:r>
+              <w:rPr>
+                <w:rFonts w:ascii="Calibri" w:hAnsi="Calibri" w:eastAsia="Calibri" w:cs="Calibri"/>
+              </w:rPr>
+            </w:r>
+            <w:r>
+              <w:rPr>
+                <w:rFonts w:ascii="Calibri" w:hAnsi="Calibri" w:eastAsia="Calibri" w:cs="Calibri"/>
+                <w:sz w:val="16"/>
+              </w:rPr>
+              <w:t>AI-M4-A4</w:t>
+            </w:r>
+          </w:p>
+        </w:tc>
+        <w:tc>
+          <w:tcPr>
+            <w:tcW w:type="dxa" w:w="1361"/>
+          </w:tcPr>
+          <w:p>
+            <w:pPr>
+              <w:spacing w:after="0"/>
+            </w:pPr>
+            <w:r>
+              <w:rPr>
+                <w:rFonts w:ascii="Calibri" w:hAnsi="Calibri" w:eastAsia="Calibri" w:cs="Calibri"/>
+              </w:rPr>
+            </w:r>
+            <w:r>
+              <w:rPr>
+                <w:rFonts w:ascii="Calibri" w:hAnsi="Calibri" w:eastAsia="Calibri" w:cs="Calibri"/>
+                <w:sz w:val="16"/>
+              </w:rPr>
+              <w:t>19 Oct 2026</w:t>
+            </w:r>
+          </w:p>
+          <w:p>
+            <w:pPr>
+              <w:spacing w:after="0"/>
+            </w:pPr>
+            <w:r>
+              <w:rPr>
+                <w:rFonts w:ascii="Calibri" w:hAnsi="Calibri" w:eastAsia="Calibri" w:cs="Calibri"/>
+                <w:sz w:val="16"/>
+              </w:rPr>
+              <w:t>Alexander (A)</w:t>
+            </w:r>
+          </w:p>
+          <w:p>
+            <w:pPr>
+              <w:spacing w:after="0"/>
+            </w:pPr>
+            <w:r>
+              <w:rPr>
+                <w:rFonts w:ascii="Calibri" w:hAnsi="Calibri" w:eastAsia="Calibri" w:cs="Calibri"/>
+                <w:sz w:val="16"/>
+              </w:rPr>
+              <w:t>Claude (Anthropic)</w:t>
+            </w:r>
+          </w:p>
+        </w:tc>
+        <w:tc>
+          <w:tcPr>
+            <w:tcW w:type="dxa" w:w="2438"/>
+          </w:tcPr>
+          <w:p>
+            <w:pPr>
+              <w:spacing w:after="0"/>
+            </w:pPr>
+            <w:r>
+              <w:rPr>
+                <w:rFonts w:ascii="Calibri" w:hAnsi="Calibri" w:eastAsia="Calibri" w:cs="Calibri"/>
+              </w:rPr>
+            </w:r>
+            <w:r>
+              <w:rPr>
+                <w:rFonts w:ascii="Calibri" w:hAnsi="Calibri" w:eastAsia="Calibri" w:cs="Calibri"/>
+                <w:sz w:val="16"/>
+              </w:rPr>
+              <w:t>Document tidy-up. Claude added the student numbers to the cover, the table and figure captions, converted the reference list to Harvard style, fixed two typos and widened a table column in my Word file.</w:t>
+            </w:r>
+          </w:p>
+        </w:tc>
+        <w:tc>
+          <w:tcPr>
+            <w:tcW w:type="dxa" w:w="2154"/>
+          </w:tcPr>
+          <w:p>
+            <w:pPr>
+              <w:spacing w:after="0"/>
+            </w:pPr>
+            <w:r>
+              <w:rPr>
+                <w:rFonts w:ascii="Calibri" w:hAnsi="Calibri" w:eastAsia="Calibri" w:cs="Calibri"/>
+              </w:rPr>
+            </w:r>
+            <w:r>
+              <w:rPr>
+                <w:rFonts w:ascii="Calibri" w:hAnsi="Calibri" w:eastAsia="Calibri" w:cs="Calibri"/>
+                <w:sz w:val="16"/>
+              </w:rPr>
+              <w:t>Cover details checked against our student numbers. Harvard references checked against the original sources' details.</w:t>
+            </w:r>
+          </w:p>
+        </w:tc>
+        <w:tc>
+          <w:tcPr>
+            <w:tcW w:type="dxa" w:w="2098"/>
+          </w:tcPr>
+          <w:p>
+            <w:pPr>
+              <w:spacing w:after="0"/>
+            </w:pPr>
+            <w:r>
+              <w:rPr>
+                <w:rFonts w:ascii="Calibri" w:hAnsi="Calibri" w:eastAsia="Calibri" w:cs="Calibri"/>
+              </w:rPr>
+            </w:r>
+            <w:r>
+              <w:rPr>
+                <w:rFonts w:ascii="Calibri" w:hAnsi="Calibri" w:eastAsia="Calibri" w:cs="Calibri"/>
+                <w:sz w:val="16"/>
+              </w:rPr>
+              <w:t>Accepted. I will check the compiled report for consistent referencing with Timothy.</w:t>
+            </w:r>
+          </w:p>
+        </w:tc>
+      </w:tr>
+      <w:tr>
+        <w:tc>
+          <w:tcPr>
+            <w:tcW w:type="dxa" w:w="964"/>
+          </w:tcPr>
+          <w:p>
+            <w:pPr>
+              <w:spacing w:after="0"/>
+            </w:pPr>
+            <w:r>
+              <w:rPr>
+                <w:rFonts w:ascii="Calibri" w:hAnsi="Calibri" w:eastAsia="Calibri" w:cs="Calibri"/>
+              </w:rPr>
+            </w:r>
+            <w:r>
+              <w:rPr>
+                <w:rFonts w:ascii="Calibri" w:hAnsi="Calibri" w:eastAsia="Calibri" w:cs="Calibri"/>
+                <w:sz w:val="16"/>
+              </w:rPr>
+              <w:t>AI-M4-A5</w:t>
+            </w:r>
+          </w:p>
+        </w:tc>
+        <w:tc>
+          <w:tcPr>
+            <w:tcW w:type="dxa" w:w="1361"/>
+          </w:tcPr>
+          <w:p>
+            <w:pPr>
+              <w:spacing w:after="0"/>
+            </w:pPr>
+            <w:r>
+              <w:rPr>
+                <w:rFonts w:ascii="Calibri" w:hAnsi="Calibri" w:eastAsia="Calibri" w:cs="Calibri"/>
+              </w:rPr>
+            </w:r>
+            <w:r>
+              <w:rPr>
+                <w:rFonts w:ascii="Calibri" w:hAnsi="Calibri" w:eastAsia="Calibri" w:cs="Calibri"/>
+                <w:sz w:val="16"/>
+              </w:rPr>
+              <w:t>19 Oct 2026</w:t>
+            </w:r>
+          </w:p>
+          <w:p>
+            <w:pPr>
+              <w:spacing w:after="0"/>
+            </w:pPr>
+            <w:r>
+              <w:rPr>
+                <w:rFonts w:ascii="Calibri" w:hAnsi="Calibri" w:eastAsia="Calibri" w:cs="Calibri"/>
+                <w:sz w:val="16"/>
+              </w:rPr>
+              <w:t>Alexander (A)</w:t>
+            </w:r>
+          </w:p>
+          <w:p>
+            <w:pPr>
+              <w:spacing w:after="0"/>
+            </w:pPr>
+            <w:r>
+              <w:rPr>
+                <w:rFonts w:ascii="Calibri" w:hAnsi="Calibri" w:eastAsia="Calibri" w:cs="Calibri"/>
+                <w:sz w:val="16"/>
+              </w:rPr>
+              <w:t>Claude (Anthropic)</w:t>
+            </w:r>
+          </w:p>
+        </w:tc>
+        <w:tc>
+          <w:tcPr>
+            <w:tcW w:type="dxa" w:w="2438"/>
+          </w:tcPr>
+          <w:p>
+            <w:pPr>
+              <w:spacing w:after="0"/>
+            </w:pPr>
+            <w:r>
+              <w:rPr>
+                <w:rFonts w:ascii="Calibri" w:hAnsi="Calibri" w:eastAsia="Calibri" w:cs="Calibri"/>
+              </w:rPr>
+            </w:r>
+            <w:r>
+              <w:rPr>
+                <w:rFonts w:ascii="Calibri" w:hAnsi="Calibri" w:eastAsia="Calibri" w:cs="Calibri"/>
+                <w:sz w:val="16"/>
+              </w:rPr>
+              <w:t>Helped with reviewing my personal reflection and gave improvements.</w:t>
+            </w:r>
+          </w:p>
+        </w:tc>
+        <w:tc>
+          <w:tcPr>
+            <w:tcW w:type="dxa" w:w="2154"/>
+          </w:tcPr>
+          <w:p>
+            <w:pPr>
+              <w:spacing w:after="0"/>
+            </w:pPr>
+            <w:r>
+              <w:rPr>
+                <w:rFonts w:ascii="Calibri" w:hAnsi="Calibri" w:eastAsia="Calibri" w:cs="Calibri"/>
+              </w:rPr>
+            </w:r>
+            <w:r>
+              <w:rPr>
+                <w:rFonts w:ascii="Calibri" w:hAnsi="Calibri" w:eastAsia="Calibri" w:cs="Calibri"/>
+                <w:sz w:val="16"/>
+              </w:rPr>
+              <w:t>Not applicable: a reflection cannot be checked against data.</w:t>
+            </w:r>
+          </w:p>
+        </w:tc>
+        <w:tc>
+          <w:tcPr>
+            <w:tcW w:type="dxa" w:w="2098"/>
+          </w:tcPr>
+          <w:p>
+            <w:pPr>
+              <w:spacing w:after="0"/>
+            </w:pPr>
+            <w:r>
+              <w:rPr>
+                <w:rFonts w:ascii="Calibri" w:hAnsi="Calibri" w:eastAsia="Calibri" w:cs="Calibri"/>
+              </w:rPr>
+            </w:r>
+            <w:r>
+              <w:rPr>
+                <w:rFonts w:ascii="Calibri" w:hAnsi="Calibri" w:eastAsia="Calibri" w:cs="Calibri"/>
+                <w:sz w:val="16"/>
+              </w:rPr>
+              <w:t>A reflection that I did not write would not be my reflection, and this entry records that Claude did help with improvement.</w:t>
             </w:r>
           </w:p>
         </w:tc>
@@ -12735,7 +13330,54 @@
         <w:pStyle w:val="Heading3"/>
       </w:pPr>
       <w:r>
-        <w:t>7. Reflections - Alexander Solomon (Person A) and Rudi Jan du Plessis (Person B)</w:t>
+        <w:t>7. Reflection - Alexander Solomon (Person A)</w:t>
+      </w:r>
+    </w:p>
+    <w:p>
+      <w:pPr>
+        <w:spacing w:after="120" w:line="276" w:lineRule="auto"/>
+      </w:pPr>
+      <w:r>
+        <w:rPr>
+          <w:rFonts w:ascii="Calibri" w:hAnsi="Calibri" w:eastAsia="Calibri" w:cs="Calibri"/>
+          <w:b w:val="0"/>
+          <w:i w:val="0"/>
+        </w:rPr>
+        <w:t>What worked best for this project is that we split it into 3, so each person did a specific section of each milestone. Because I built the modelling and then wrote about it, I could explain every choice. Writing down in Milestone 2 that we would fall back to a binary target if the middle tier couldn't be separated also paid off. When the three-tier models failed to find that tier, we switched without scrambling.</w:t>
+      </w:r>
+    </w:p>
+    <w:p>
+      <w:pPr>
+        <w:spacing w:after="120" w:line="276" w:lineRule="auto"/>
+      </w:pPr>
+      <w:r>
+        <w:rPr>
+          <w:rFonts w:ascii="Calibri" w:hAnsi="Calibri" w:eastAsia="Calibri" w:cs="Calibri"/>
+          <w:b w:val="0"/>
+          <w:i w:val="0"/>
+        </w:rPr>
+        <w:t>The biggest surprise was how much went wrong in such small, practical places. My leakage checks failed because I assumed the integrated file was already trimmed, when it still had 128 columns. Later, I ran renv::init() in the wrong project folder and had to redo it. Across the milestones, the target and the final model changed more than I expected, and the project grew from an analysis into a tool with monitoring.</w:t>
+      </w:r>
+    </w:p>
+    <w:p>
+      <w:pPr>
+        <w:spacing w:after="120" w:line="276" w:lineRule="auto"/>
+      </w:pPr>
+      <w:r>
+        <w:rPr>
+          <w:rFonts w:ascii="Calibri" w:hAnsi="Calibri" w:eastAsia="Calibri" w:cs="Calibri"/>
+          <w:b w:val="0"/>
+          <w:i w:val="0"/>
+        </w:rPr>
+        <w:t>I learned how tidymodels recipes keep preprocessing inside each cross-validation fold, and how to work with Git and GitHub as a team. Next time, I would agree on the model's output format with whoever builds the app much earlier, because the three-tier vs binary mismatch cost us time, and I would set up renv on the first day.</w:t>
+      </w:r>
+    </w:p>
+    <w:p>
+      <w:pPr>
+        <w:pStyle w:val="Heading3"/>
+      </w:pPr>
+      <w:r>
+        <w:t>8. Reflection - Rudi Jan du Plessis (Person B)</w:t>
       </w:r>
     </w:p>
     <w:p>
@@ -12748,7 +13390,7 @@
           <w:b w:val="0"/>
           <w:i/>
         </w:rPr>
-        <w:t>TO CONFIRM - each member writes 150 to 200 words on what worked, what surprised them, what changed across the milestones, what they learned and what they would improve, merged under their own name.</w:t>
+        <w:t>TO CONFIRM - 150 to 200 words on what worked, what surprised him, what changed across the milestones, what he learned and what he would improve.</w:t>
       </w:r>
     </w:p>
     <w:sectPr>

</xml_diff>